<commit_message>
fix: removed the old resume file fron assets. Modified resume content for final draft.
</commit_message>
<xml_diff>
--- a/public/files/DeveloperResume_August2026.docx
+++ b/public/files/DeveloperResume_August2026.docx
@@ -109,29 +109,6 @@
         <w:pBdr>
           <w:top w:color="auto" w:space="0" w:sz="0" w:val="none"/>
           <w:left w:color="auto" w:space="0" w:sz="0" w:val="none"/>
-          <w:bottom w:color="auto" w:space="0" w:sz="0" w:val="none"/>
-          <w:right w:color="auto" w:space="0" w:sz="0" w:val="none"/>
-          <w:between w:color="auto" w:space="0" w:sz="0" w:val="none"/>
-        </w:pBdr>
-        <w:shd w:fill="ffffff" w:val="clear"/>
-        <w:spacing w:after="60" w:line="240" w:lineRule="auto"/>
-        <w:jc w:val="center"/>
-        <w:rPr>
-          <w:rFonts w:ascii="Calibri" w:cs="Calibri" w:eastAsia="Calibri" w:hAnsi="Calibri"/>
-          <w:u w:val="single"/>
-        </w:rPr>
-      </w:pPr>
-      <w:r>
-        <w:rPr>
-          <w:rtl w:val="0"/>
-        </w:rPr>
-      </w:r>
-    </w:p>
-    <w:p>
-      <w:pPr>
-        <w:pBdr>
-          <w:top w:color="auto" w:space="0" w:sz="0" w:val="none"/>
-          <w:left w:color="auto" w:space="0" w:sz="0" w:val="none"/>
           <w:bottom w:color="808080" w:space="0" w:sz="6" w:val="single"/>
           <w:right w:color="auto" w:space="0" w:sz="0" w:val="none"/>
         </w:pBdr>
@@ -268,6 +245,105 @@
         <w:spacing w:line="240" w:lineRule="auto"/>
         <w:rPr>
           <w:rFonts w:ascii="Calibri" w:cs="Calibri" w:eastAsia="Calibri" w:hAnsi="Calibri"/>
+          <w:color w:val="073763"/>
+          <w:sz w:val="26"/>
+          <w:szCs w:val="26"/>
+        </w:rPr>
+      </w:pPr>
+      <w:r>
+        <w:rPr>
+          <w:rFonts w:ascii="Calibri" w:cs="Calibri" w:eastAsia="Calibri" w:hAnsi="Calibri"/>
+          <w:b w:val="1"/>
+          <w:bCs w:val="1"/>
+          <w:color w:val="073763"/>
+          <w:sz w:val="26"/>
+          <w:szCs w:val="26"/>
+          <w:rtl w:val="0"/>
+        </w:rPr>
+        <w:t xml:space="preserve">Pantry Connect — Full Stack Food Pantry Notification System   </w:t>
+      </w:r>
+      <w:r>
+        <w:rPr>
+          <w:rFonts w:ascii="Calibri" w:cs="Calibri" w:eastAsia="Calibri" w:hAnsi="Calibri"/>
+          <w:color w:val="073763"/>
+          <w:sz w:val="26"/>
+          <w:szCs w:val="26"/>
+          <w:rtl w:val="0"/>
+        </w:rPr>
+        <w:t xml:space="preserve">Apr</w:t>
+      </w:r>
+      <w:r>
+        <w:rPr>
+          <w:rFonts w:ascii="Calibri" w:cs="Calibri" w:eastAsia="Calibri" w:hAnsi="Calibri"/>
+          <w:color w:val="073763"/>
+          <w:sz w:val="26"/>
+          <w:szCs w:val="26"/>
+          <w:rtl w:val="0"/>
+        </w:rPr>
+        <w:t xml:space="preserve"> 2026 – June 2026</w:t>
+      </w:r>
+    </w:p>
+    <w:p>
+      <w:pPr>
+        <w:pBdr>
+          <w:top w:color="auto" w:space="0" w:sz="0" w:val="none"/>
+          <w:left w:color="auto" w:space="0" w:sz="0" w:val="none"/>
+          <w:bottom w:color="auto" w:space="0" w:sz="0" w:val="none"/>
+          <w:right w:color="auto" w:space="0" w:sz="0" w:val="none"/>
+          <w:between w:color="auto" w:space="0" w:sz="0" w:val="none"/>
+        </w:pBdr>
+        <w:shd w:fill="ffffff" w:val="clear"/>
+        <w:spacing w:line="240" w:lineRule="auto"/>
+        <w:rPr>
+          <w:rFonts w:ascii="Calibri" w:cs="Calibri" w:eastAsia="Calibri" w:hAnsi="Calibri"/>
+          <w:color w:val="073763"/>
+        </w:rPr>
+      </w:pPr>
+      <w:r>
+        <w:rPr>
+          <w:rFonts w:ascii="Calibri" w:cs="Calibri" w:eastAsia="Calibri" w:hAnsi="Calibri"/>
+          <w:rtl w:val="0"/>
+        </w:rPr>
+        <w:t xml:space="preserve">Full-stack food pantry notification system developed as a capstone project to help a college food pantry communicate availability and events to students. Personally developed account creation, login, and password reset functionality using Node.js and Express, building a secure authentication workflow from scratch.                                                </w:t>
+      </w:r>
+      <w:r>
+        <w:rPr>
+          <w:rFonts w:ascii="Calibri" w:cs="Calibri" w:eastAsia="Calibri" w:hAnsi="Calibri"/>
+          <w:i w:val="1"/>
+          <w:iCs w:val="1"/>
+          <w:rtl w:val="0"/>
+        </w:rPr>
+        <w:t xml:space="preserve">GitHub: </w:t>
+      </w:r>
+      <w:hyperlink r:id="rId8">
+        <w:r>
+          <w:rPr>
+            <w:rFonts w:ascii="Calibri" w:cs="Calibri" w:eastAsia="Calibri" w:hAnsi="Calibri"/>
+            <w:color w:val="073763"/>
+            <w:rtl w:val="0"/>
+          </w:rPr>
+          <w:t xml:space="preserve">github.com/bconard36/PCC-Food-Pantry-Notification-System</w:t>
+        </w:r>
+      </w:hyperlink>
+      <w:r>
+        <w:rPr>
+          <w:rtl w:val="0"/>
+        </w:rPr>
+      </w:r>
+    </w:p>
+    <w:p>
+      <w:pPr>
+        <w:pBdr>
+          <w:top w:color="auto" w:space="0" w:sz="0" w:val="none"/>
+          <w:left w:color="auto" w:space="0" w:sz="0" w:val="none"/>
+          <w:bottom w:color="auto" w:space="0" w:sz="0" w:val="none"/>
+          <w:right w:color="auto" w:space="0" w:sz="0" w:val="none"/>
+          <w:between w:color="auto" w:space="0" w:sz="0" w:val="none"/>
+        </w:pBdr>
+        <w:shd w:fill="ffffff" w:val="clear"/>
+        <w:spacing w:line="240" w:lineRule="auto"/>
+        <w:rPr>
+          <w:rFonts w:ascii="Calibri" w:cs="Calibri" w:eastAsia="Calibri" w:hAnsi="Calibri"/>
           <w:color w:val="4f81bd"/>
           <w:sz w:val="24"/>
           <w:szCs w:val="24"/>
@@ -352,7 +428,7 @@
         </w:rPr>
         <w:t xml:space="preserve"> </w:t>
       </w:r>
-      <w:hyperlink r:id="rId8">
+      <w:hyperlink r:id="rId9">
         <w:r>
           <w:rPr>
             <w:rFonts w:ascii="Calibri" w:cs="Calibri" w:eastAsia="Calibri" w:hAnsi="Calibri"/>
@@ -381,24 +457,25 @@
         <w:spacing w:line="240" w:lineRule="auto"/>
         <w:rPr>
           <w:rFonts w:ascii="Calibri" w:cs="Calibri" w:eastAsia="Calibri" w:hAnsi="Calibri"/>
-          <w:color w:val="4f81bd"/>
-          <w:sz w:val="24"/>
-          <w:szCs w:val="24"/>
-        </w:rPr>
-      </w:pPr>
-      <w:r>
-        <w:rPr>
-          <w:rFonts w:ascii="Calibri" w:cs="Calibri" w:eastAsia="Calibri" w:hAnsi="Calibri"/>
-          <w:b w:val="1"/>
-          <w:bCs w:val="1"/>
-          <w:color w:val="073763"/>
-          <w:sz w:val="26"/>
-          <w:szCs w:val="26"/>
-          <w:rtl w:val="0"/>
-        </w:rPr>
-        <w:t xml:space="preserve">SkuSuks — React E-Commerce Application</w:t>
-      </w:r>
-      <w:r>
+          <w:color w:val="073763"/>
+        </w:rPr>
+      </w:pPr>
+      <w:r>
+        <w:rPr>
+          <w:rtl w:val="0"/>
+        </w:rPr>
+      </w:r>
+    </w:p>
+    <w:p>
+      <w:pPr>
+        <w:pBdr>
+          <w:top w:color="auto" w:space="0" w:sz="0" w:val="none"/>
+          <w:left w:color="auto" w:space="0" w:sz="0" w:val="none"/>
+          <w:bottom w:color="808080" w:space="0" w:sz="6" w:val="single"/>
+          <w:right w:color="auto" w:space="0" w:sz="0" w:val="none"/>
+        </w:pBdr>
+        <w:shd w:fill="ffffff" w:val="clear"/>
+        <w:spacing w:after="40" w:before="100" w:line="240" w:lineRule="auto"/>
         <w:rPr>
           <w:rFonts w:ascii="Calibri" w:cs="Calibri" w:eastAsia="Calibri" w:hAnsi="Calibri"/>
           <w:b w:val="1"/>
@@ -406,113 +483,9 @@
           <w:color w:val="073763"/>
           <w:sz w:val="28"/>
           <w:szCs w:val="28"/>
-          <w:rtl w:val="0"/>
-        </w:rPr>
-        <w:t xml:space="preserve">                                   </w:t>
-      </w:r>
-      <w:r>
-        <w:rPr>
-          <w:rFonts w:ascii="Calibri" w:cs="Calibri" w:eastAsia="Calibri" w:hAnsi="Calibri"/>
-          <w:color w:val="073763"/>
-          <w:sz w:val="26"/>
-          <w:szCs w:val="26"/>
-          <w:rtl w:val="0"/>
-        </w:rPr>
-        <w:t xml:space="preserve">Apr 2025 – Jun 2026</w:t>
-      </w:r>
-      <w:r>
-        <w:rPr>
-          <w:rtl w:val="0"/>
-        </w:rPr>
-      </w:r>
-    </w:p>
-    <w:p>
-      <w:pPr>
-        <w:pBdr>
-          <w:top w:color="auto" w:space="0" w:sz="0" w:val="none"/>
-          <w:left w:color="auto" w:space="0" w:sz="0" w:val="none"/>
-          <w:bottom w:color="auto" w:space="0" w:sz="0" w:val="none"/>
-          <w:right w:color="auto" w:space="0" w:sz="0" w:val="none"/>
-          <w:between w:color="auto" w:space="0" w:sz="0" w:val="none"/>
-        </w:pBdr>
-        <w:shd w:fill="ffffff" w:val="clear"/>
-        <w:spacing w:line="240" w:lineRule="auto"/>
-        <w:rPr>
-          <w:rFonts w:ascii="Calibri" w:cs="Calibri" w:eastAsia="Calibri" w:hAnsi="Calibri"/>
-          <w:color w:val="073763"/>
-        </w:rPr>
-      </w:pPr>
-      <w:r>
-        <w:rPr>
-          <w:rFonts w:ascii="Calibri" w:cs="Calibri" w:eastAsia="Calibri" w:hAnsi="Calibri"/>
-          <w:rtl w:val="0"/>
-        </w:rPr>
-        <w:t xml:space="preserve">Partnered with the business owner to design and build a responsive front-end application, then refactored it into a React storefront with scalable product architecture for future Shopify and payment integration.                                                                                              </w:t>
-      </w:r>
-      <w:r>
-        <w:rPr>
-          <w:rFonts w:ascii="Calibri" w:cs="Calibri" w:eastAsia="Calibri" w:hAnsi="Calibri"/>
-          <w:i w:val="1"/>
-          <w:iCs w:val="1"/>
-          <w:rtl w:val="0"/>
-        </w:rPr>
-        <w:t xml:space="preserve">Live:</w:t>
-      </w:r>
-      <w:r>
-        <w:rPr>
-          <w:rFonts w:ascii="Calibri" w:cs="Calibri" w:eastAsia="Calibri" w:hAnsi="Calibri"/>
-          <w:rtl w:val="0"/>
-        </w:rPr>
-        <w:t xml:space="preserve"> </w:t>
-      </w:r>
-      <w:hyperlink r:id="rId9">
-        <w:r>
-          <w:rPr>
-            <w:rFonts w:ascii="Calibri" w:cs="Calibri" w:eastAsia="Calibri" w:hAnsi="Calibri"/>
-            <w:color w:val="073763"/>
-            <w:rtl w:val="0"/>
-          </w:rPr>
-          <w:t xml:space="preserve">sku-suks-react-refactor.vercel.app</w:t>
-        </w:r>
-      </w:hyperlink>
-      <w:r>
-        <w:rPr>
-          <w:rtl w:val="0"/>
-        </w:rPr>
-      </w:r>
-    </w:p>
-    <w:p>
-      <w:pPr>
-        <w:pBdr>
-          <w:top w:color="auto" w:space="0" w:sz="0" w:val="none"/>
-          <w:left w:color="auto" w:space="0" w:sz="0" w:val="none"/>
-          <w:bottom w:color="auto" w:space="0" w:sz="0" w:val="none"/>
-          <w:right w:color="auto" w:space="0" w:sz="0" w:val="none"/>
-          <w:between w:color="auto" w:space="0" w:sz="0" w:val="none"/>
-        </w:pBdr>
-        <w:shd w:fill="ffffff" w:val="clear"/>
-        <w:spacing w:line="240" w:lineRule="auto"/>
-        <w:rPr>
-          <w:rFonts w:ascii="Calibri" w:cs="Calibri" w:eastAsia="Calibri" w:hAnsi="Calibri"/>
-          <w:color w:val="073763"/>
-        </w:rPr>
-      </w:pPr>
-      <w:r>
-        <w:rPr>
-          <w:rtl w:val="0"/>
-        </w:rPr>
-      </w:r>
-    </w:p>
-    <w:p>
-      <w:pPr>
-        <w:pBdr>
-          <w:top w:color="auto" w:space="0" w:sz="0" w:val="none"/>
-          <w:left w:color="auto" w:space="0" w:sz="0" w:val="none"/>
-          <w:bottom w:color="808080" w:space="0" w:sz="6" w:val="single"/>
-          <w:right w:color="auto" w:space="0" w:sz="0" w:val="none"/>
-        </w:pBdr>
-        <w:shd w:fill="ffffff" w:val="clear"/>
-        <w:spacing w:after="40" w:before="100" w:line="240" w:lineRule="auto"/>
+        </w:rPr>
+      </w:pPr>
+      <w:r>
         <w:rPr>
           <w:rFonts w:ascii="Calibri" w:cs="Calibri" w:eastAsia="Calibri" w:hAnsi="Calibri"/>
           <w:b w:val="1"/>
@@ -520,9 +493,67 @@
           <w:color w:val="073763"/>
           <w:sz w:val="28"/>
           <w:szCs w:val="28"/>
-        </w:rPr>
-      </w:pPr>
-      <w:r>
+          <w:rtl w:val="0"/>
+        </w:rPr>
+        <w:t xml:space="preserve">TECHNICAL SKILLS</w:t>
+      </w:r>
+    </w:p>
+    <w:p>
+      <w:pPr>
+        <w:pBdr>
+          <w:top w:color="auto" w:space="0" w:sz="0" w:val="none"/>
+          <w:left w:color="auto" w:space="0" w:sz="0" w:val="none"/>
+          <w:bottom w:color="auto" w:space="0" w:sz="0" w:val="none"/>
+          <w:right w:color="auto" w:space="0" w:sz="0" w:val="none"/>
+          <w:between w:color="auto" w:space="0" w:sz="0" w:val="none"/>
+        </w:pBdr>
+        <w:shd w:fill="ffffff" w:val="clear"/>
+        <w:spacing w:after="20" w:line="240" w:lineRule="auto"/>
+        <w:jc w:val="center"/>
+        <w:rPr>
+          <w:rFonts w:ascii="Calibri" w:cs="Calibri" w:eastAsia="Calibri" w:hAnsi="Calibri"/>
+        </w:rPr>
+      </w:pPr>
+      <w:r>
+        <w:rPr>
+          <w:rFonts w:ascii="Calibri" w:cs="Calibri" w:eastAsia="Calibri" w:hAnsi="Calibri"/>
+          <w:rtl w:val="0"/>
+        </w:rPr>
+        <w:t xml:space="preserve">React | JavaScript | HTML5/CSS3 | React Hook Form | Supabase | PostgreSQL | SQL | Database Design Responsive Web Design | Git | UI/UX | Python | Data Visualization | Adobe Creative Cloud</w:t>
+      </w:r>
+    </w:p>
+    <w:p>
+      <w:pPr>
+        <w:pBdr>
+          <w:top w:color="auto" w:space="0" w:sz="0" w:val="none"/>
+          <w:left w:color="auto" w:space="0" w:sz="0" w:val="none"/>
+          <w:bottom w:color="auto" w:space="0" w:sz="0" w:val="none"/>
+          <w:right w:color="auto" w:space="0" w:sz="0" w:val="none"/>
+          <w:between w:color="auto" w:space="0" w:sz="0" w:val="none"/>
+        </w:pBdr>
+        <w:shd w:fill="ffffff" w:val="clear"/>
+        <w:spacing w:after="20" w:line="240" w:lineRule="auto"/>
+        <w:jc w:val="center"/>
+        <w:rPr>
+          <w:rFonts w:ascii="Calibri" w:cs="Calibri" w:eastAsia="Calibri" w:hAnsi="Calibri"/>
+        </w:rPr>
+      </w:pPr>
+      <w:r>
+        <w:rPr>
+          <w:rtl w:val="0"/>
+        </w:rPr>
+      </w:r>
+    </w:p>
+    <w:p>
+      <w:pPr>
+        <w:pBdr>
+          <w:top w:color="auto" w:space="0" w:sz="0" w:val="none"/>
+          <w:left w:color="auto" w:space="0" w:sz="0" w:val="none"/>
+          <w:bottom w:color="808080" w:space="0" w:sz="6" w:val="single"/>
+          <w:right w:color="auto" w:space="0" w:sz="0" w:val="none"/>
+        </w:pBdr>
+        <w:shd w:fill="ffffff" w:val="clear"/>
+        <w:spacing w:after="40" w:before="100" w:line="240" w:lineRule="auto"/>
         <w:rPr>
           <w:rFonts w:ascii="Calibri" w:cs="Calibri" w:eastAsia="Calibri" w:hAnsi="Calibri"/>
           <w:b w:val="1"/>
@@ -530,67 +561,9 @@
           <w:color w:val="073763"/>
           <w:sz w:val="28"/>
           <w:szCs w:val="28"/>
-          <w:rtl w:val="0"/>
-        </w:rPr>
-        <w:t xml:space="preserve">TECHNICAL SKILLS</w:t>
-      </w:r>
-    </w:p>
-    <w:p>
-      <w:pPr>
-        <w:pBdr>
-          <w:top w:color="auto" w:space="0" w:sz="0" w:val="none"/>
-          <w:left w:color="auto" w:space="0" w:sz="0" w:val="none"/>
-          <w:bottom w:color="auto" w:space="0" w:sz="0" w:val="none"/>
-          <w:right w:color="auto" w:space="0" w:sz="0" w:val="none"/>
-          <w:between w:color="auto" w:space="0" w:sz="0" w:val="none"/>
-        </w:pBdr>
-        <w:shd w:fill="ffffff" w:val="clear"/>
-        <w:spacing w:after="20" w:line="240" w:lineRule="auto"/>
-        <w:jc w:val="center"/>
-        <w:rPr>
-          <w:rFonts w:ascii="Calibri" w:cs="Calibri" w:eastAsia="Calibri" w:hAnsi="Calibri"/>
-        </w:rPr>
-      </w:pPr>
-      <w:r>
-        <w:rPr>
-          <w:rFonts w:ascii="Calibri" w:cs="Calibri" w:eastAsia="Calibri" w:hAnsi="Calibri"/>
-          <w:rtl w:val="0"/>
-        </w:rPr>
-        <w:t xml:space="preserve">React | JavaScript | HTML5/CSS3 | React Hook Form | Supabase | PostgreSQL | SQL | Database Design Responsive Web Design | Git | UI/UX | Python | Data Visualization | Adobe Creative Cloud</w:t>
-      </w:r>
-    </w:p>
-    <w:p>
-      <w:pPr>
-        <w:pBdr>
-          <w:top w:color="auto" w:space="0" w:sz="0" w:val="none"/>
-          <w:left w:color="auto" w:space="0" w:sz="0" w:val="none"/>
-          <w:bottom w:color="auto" w:space="0" w:sz="0" w:val="none"/>
-          <w:right w:color="auto" w:space="0" w:sz="0" w:val="none"/>
-          <w:between w:color="auto" w:space="0" w:sz="0" w:val="none"/>
-        </w:pBdr>
-        <w:shd w:fill="ffffff" w:val="clear"/>
-        <w:spacing w:after="20" w:line="240" w:lineRule="auto"/>
-        <w:jc w:val="center"/>
-        <w:rPr>
-          <w:rFonts w:ascii="Calibri" w:cs="Calibri" w:eastAsia="Calibri" w:hAnsi="Calibri"/>
-        </w:rPr>
-      </w:pPr>
-      <w:r>
-        <w:rPr>
-          <w:rtl w:val="0"/>
-        </w:rPr>
-      </w:r>
-    </w:p>
-    <w:p>
-      <w:pPr>
-        <w:pBdr>
-          <w:top w:color="auto" w:space="0" w:sz="0" w:val="none"/>
-          <w:left w:color="auto" w:space="0" w:sz="0" w:val="none"/>
-          <w:bottom w:color="808080" w:space="0" w:sz="6" w:val="single"/>
-          <w:right w:color="auto" w:space="0" w:sz="0" w:val="none"/>
-        </w:pBdr>
-        <w:shd w:fill="ffffff" w:val="clear"/>
-        <w:spacing w:after="40" w:before="100" w:line="240" w:lineRule="auto"/>
+        </w:rPr>
+      </w:pPr>
+      <w:r>
         <w:rPr>
           <w:rFonts w:ascii="Calibri" w:cs="Calibri" w:eastAsia="Calibri" w:hAnsi="Calibri"/>
           <w:b w:val="1"/>
@@ -598,16 +571,6 @@
           <w:color w:val="073763"/>
           <w:sz w:val="28"/>
           <w:szCs w:val="28"/>
-        </w:rPr>
-      </w:pPr>
-      <w:r>
-        <w:rPr>
-          <w:rFonts w:ascii="Calibri" w:cs="Calibri" w:eastAsia="Calibri" w:hAnsi="Calibri"/>
-          <w:b w:val="1"/>
-          <w:bCs w:val="1"/>
-          <w:color w:val="073763"/>
-          <w:sz w:val="28"/>
-          <w:szCs w:val="28"/>
           <w:rtl w:val="0"/>
         </w:rPr>
         <w:t xml:space="preserve">EDUCATION</w:t>
@@ -849,8 +812,7 @@
           <w:between w:color="auto" w:space="0" w:sz="0" w:val="none"/>
         </w:pBdr>
         <w:shd w:fill="ffffff" w:val="clear"/>
-        <w:spacing w:after="20" w:line="240" w:lineRule="auto"/>
-        <w:jc w:val="center"/>
+        <w:spacing w:line="240" w:lineRule="auto"/>
         <w:rPr>
           <w:rFonts w:ascii="Calibri" w:cs="Calibri" w:eastAsia="Calibri" w:hAnsi="Calibri"/>
         </w:rPr>

</xml_diff>

<commit_message>
docs: added an updated resume
</commit_message>
<xml_diff>
--- a/public/files/DeveloperResume_August2026.docx
+++ b/public/files/DeveloperResume_August2026.docx
@@ -52,13 +52,17 @@
           <w:rFonts w:ascii="Calibri" w:cs="Calibri" w:eastAsia="Calibri" w:hAnsi="Calibri"/>
           <w:b w:val="1"/>
           <w:bCs w:val="1"/>
-        </w:rPr>
-      </w:pPr>
-      <w:r>
-        <w:rPr>
-          <w:rFonts w:ascii="Calibri" w:cs="Calibri" w:eastAsia="Calibri" w:hAnsi="Calibri"/>
-          <w:b w:val="1"/>
-          <w:bCs w:val="1"/>
+          <w:sz w:val="24"/>
+          <w:szCs w:val="24"/>
+        </w:rPr>
+      </w:pPr>
+      <w:r>
+        <w:rPr>
+          <w:rFonts w:ascii="Calibri" w:cs="Calibri" w:eastAsia="Calibri" w:hAnsi="Calibri"/>
+          <w:b w:val="1"/>
+          <w:bCs w:val="1"/>
+          <w:sz w:val="24"/>
+          <w:szCs w:val="24"/>
           <w:rtl w:val="0"/>
         </w:rPr>
         <w:t xml:space="preserve">WEB DEVELOPER | DESIGNER</w:t>
@@ -86,13 +90,21 @@
           <w:rFonts w:ascii="Calibri" w:cs="Calibri" w:eastAsia="Calibri" w:hAnsi="Calibri"/>
           <w:rtl w:val="0"/>
         </w:rPr>
-        <w:t xml:space="preserve">West Linn, OR 97068  |  (805) 416-3209  |  bconard24@gmail.com  |  </w:t>
+        <w:t xml:space="preserve">West Linn, OR 97068  |  (805) 416-3209  |  bconard24@gmail.com  | </w:t>
+      </w:r>
+      <w:r>
+        <w:rPr>
+          <w:rFonts w:ascii="Calibri" w:cs="Calibri" w:eastAsia="Calibri" w:hAnsi="Calibri"/>
+          <w:color w:val="073763"/>
+          <w:rtl w:val="0"/>
+        </w:rPr>
+        <w:t xml:space="preserve"> </w:t>
       </w:r>
       <w:hyperlink r:id="rId6">
         <w:r>
           <w:rPr>
             <w:rFonts w:ascii="Calibri" w:cs="Calibri" w:eastAsia="Calibri" w:hAnsi="Calibri"/>
-            <w:u w:val="single"/>
+            <w:color w:val="073763"/>
             <w:rtl w:val="0"/>
           </w:rPr>
           <w:t xml:space="preserve">billyconardportfolio.vercel.app</w:t>
@@ -119,37 +131,6 @@
           <w:b w:val="1"/>
           <w:bCs w:val="1"/>
           <w:color w:val="073763"/>
-          <w:sz w:val="28"/>
-          <w:szCs w:val="28"/>
-        </w:rPr>
-      </w:pPr>
-      <w:r>
-        <w:rPr>
-          <w:rFonts w:ascii="Calibri" w:cs="Calibri" w:eastAsia="Calibri" w:hAnsi="Calibri"/>
-          <w:b w:val="1"/>
-          <w:bCs w:val="1"/>
-          <w:color w:val="073763"/>
-          <w:sz w:val="28"/>
-          <w:szCs w:val="28"/>
-          <w:rtl w:val="0"/>
-        </w:rPr>
-        <w:t xml:space="preserve">PROJECTS</w:t>
-      </w:r>
-    </w:p>
-    <w:p>
-      <w:pPr>
-        <w:pBdr>
-          <w:top w:color="auto" w:space="0" w:sz="0" w:val="none"/>
-          <w:left w:color="auto" w:space="0" w:sz="0" w:val="none"/>
-          <w:bottom w:color="auto" w:space="0" w:sz="0" w:val="none"/>
-          <w:right w:color="auto" w:space="0" w:sz="0" w:val="none"/>
-          <w:between w:color="auto" w:space="0" w:sz="0" w:val="none"/>
-        </w:pBdr>
-        <w:shd w:fill="ffffff" w:val="clear"/>
-        <w:spacing w:line="240" w:lineRule="auto"/>
-        <w:rPr>
-          <w:rFonts w:ascii="Calibri" w:cs="Calibri" w:eastAsia="Calibri" w:hAnsi="Calibri"/>
-          <w:color w:val="073763"/>
           <w:sz w:val="26"/>
           <w:szCs w:val="26"/>
         </w:rPr>
@@ -164,41 +145,84 @@
           <w:szCs w:val="26"/>
           <w:rtl w:val="0"/>
         </w:rPr>
-        <w:t xml:space="preserve">Momentum — React Fitness Tracking Application                              </w:t>
-      </w:r>
-      <w:r>
-        <w:rPr>
-          <w:rFonts w:ascii="Calibri" w:cs="Calibri" w:eastAsia="Calibri" w:hAnsi="Calibri"/>
+        <w:t xml:space="preserve">PROJECTS</w:t>
+      </w:r>
+    </w:p>
+    <w:p>
+      <w:pPr>
+        <w:pBdr>
+          <w:top w:color="auto" w:space="0" w:sz="0" w:val="none"/>
+          <w:left w:color="auto" w:space="0" w:sz="0" w:val="none"/>
+          <w:bottom w:color="auto" w:space="0" w:sz="0" w:val="none"/>
+          <w:right w:color="auto" w:space="0" w:sz="0" w:val="none"/>
+          <w:between w:color="auto" w:space="0" w:sz="0" w:val="none"/>
+        </w:pBdr>
+        <w:shd w:fill="ffffff" w:val="clear"/>
+        <w:spacing w:line="240" w:lineRule="auto"/>
+        <w:rPr>
+          <w:rFonts w:ascii="Calibri" w:cs="Calibri" w:eastAsia="Calibri" w:hAnsi="Calibri"/>
+          <w:color w:val="073763"/>
+          <w:sz w:val="24"/>
+          <w:szCs w:val="24"/>
+        </w:rPr>
+      </w:pPr>
+      <w:r>
+        <w:rPr>
+          <w:rFonts w:ascii="Calibri" w:cs="Calibri" w:eastAsia="Calibri" w:hAnsi="Calibri"/>
+          <w:b w:val="1"/>
+          <w:bCs w:val="1"/>
+          <w:color w:val="073763"/>
+          <w:sz w:val="24"/>
+          <w:szCs w:val="24"/>
+          <w:rtl w:val="0"/>
+        </w:rPr>
+        <w:t xml:space="preserve">Momentum — Full Stack React Application </w:t>
+      </w:r>
+      <w:r>
+        <w:rPr>
+          <w:rFonts w:ascii="Calibri" w:cs="Calibri" w:eastAsia="Calibri" w:hAnsi="Calibri"/>
+          <w:b w:val="1"/>
+          <w:bCs w:val="1"/>
           <w:color w:val="073763"/>
           <w:sz w:val="26"/>
           <w:szCs w:val="26"/>
           <w:rtl w:val="0"/>
         </w:rPr>
-        <w:t xml:space="preserve">Jul 2026 – Present</w:t>
-      </w:r>
-    </w:p>
-    <w:p>
-      <w:pPr>
-        <w:pBdr>
-          <w:top w:color="auto" w:space="0" w:sz="0" w:val="none"/>
-          <w:left w:color="auto" w:space="0" w:sz="0" w:val="none"/>
-          <w:bottom w:color="auto" w:space="0" w:sz="0" w:val="none"/>
-          <w:right w:color="auto" w:space="0" w:sz="0" w:val="none"/>
-          <w:between w:color="auto" w:space="0" w:sz="0" w:val="none"/>
-        </w:pBdr>
-        <w:shd w:fill="ffffff" w:val="clear"/>
-        <w:spacing w:line="240" w:lineRule="auto"/>
-        <w:rPr>
-          <w:rFonts w:ascii="Calibri" w:cs="Calibri" w:eastAsia="Calibri" w:hAnsi="Calibri"/>
-          <w:color w:val="073763"/>
-        </w:rPr>
-      </w:pPr>
-      <w:r>
-        <w:rPr>
-          <w:rFonts w:ascii="Calibri" w:cs="Calibri" w:eastAsia="Calibri" w:hAnsi="Calibri"/>
-          <w:rtl w:val="0"/>
-        </w:rPr>
-        <w:t xml:space="preserve">Full-stack React application currently in development, allowing users to log and review workouts stored in PostgreSQL through Supabase. Built with React Hook Form for input validation and Supabase Auth for account creation and authentication.                                        </w:t>
+        <w:t xml:space="preserve">                                                 </w:t>
+      </w:r>
+      <w:r>
+        <w:rPr>
+          <w:rFonts w:ascii="Calibri" w:cs="Calibri" w:eastAsia="Calibri" w:hAnsi="Calibri"/>
+          <w:color w:val="073763"/>
+          <w:sz w:val="24"/>
+          <w:szCs w:val="24"/>
+          <w:rtl w:val="0"/>
+        </w:rPr>
+        <w:t xml:space="preserve">Jul 2026 – Aug 2026</w:t>
+      </w:r>
+    </w:p>
+    <w:p>
+      <w:pPr>
+        <w:pBdr>
+          <w:top w:color="auto" w:space="0" w:sz="0" w:val="none"/>
+          <w:left w:color="auto" w:space="0" w:sz="0" w:val="none"/>
+          <w:bottom w:color="auto" w:space="0" w:sz="0" w:val="none"/>
+          <w:right w:color="auto" w:space="0" w:sz="0" w:val="none"/>
+          <w:between w:color="auto" w:space="0" w:sz="0" w:val="none"/>
+        </w:pBdr>
+        <w:shd w:fill="ffffff" w:val="clear"/>
+        <w:spacing w:line="240" w:lineRule="auto"/>
+        <w:rPr>
+          <w:rFonts w:ascii="Calibri" w:cs="Calibri" w:eastAsia="Calibri" w:hAnsi="Calibri"/>
+          <w:color w:val="073763"/>
+        </w:rPr>
+      </w:pPr>
+      <w:r>
+        <w:rPr>
+          <w:rFonts w:ascii="Calibri" w:cs="Calibri" w:eastAsia="Calibri" w:hAnsi="Calibri"/>
+          <w:rtl w:val="0"/>
+        </w:rPr>
+        <w:t xml:space="preserve">Full-stack React workout tracking application, allowing users to log and review workouts stored in PostgreSQL through Supabase. Built with React Hook Form for input validation and Supabase Auth for user authentication and database operations.                        </w:t>
       </w:r>
       <w:r>
         <w:rPr>
@@ -207,7 +231,7 @@
           <w:iCs w:val="1"/>
           <w:rtl w:val="0"/>
         </w:rPr>
-        <w:t xml:space="preserve">GitHub:</w:t>
+        <w:t xml:space="preserve">Live:</w:t>
       </w:r>
       <w:r>
         <w:rPr>
@@ -223,7 +247,7 @@
             <w:color w:val="073763"/>
             <w:rtl w:val="0"/>
           </w:rPr>
-          <w:t xml:space="preserve">github.com/bconard36/Momentum</w:t>
+          <w:t xml:space="preserve">momentum-workout-tracking.vercel.app</w:t>
         </w:r>
       </w:hyperlink>
       <w:r>
@@ -242,32 +266,78 @@
           <w:between w:color="auto" w:space="0" w:sz="0" w:val="none"/>
         </w:pBdr>
         <w:shd w:fill="ffffff" w:val="clear"/>
-        <w:spacing w:line="240" w:lineRule="auto"/>
-        <w:rPr>
-          <w:rFonts w:ascii="Calibri" w:cs="Calibri" w:eastAsia="Calibri" w:hAnsi="Calibri"/>
+        <w:spacing w:line="180" w:lineRule="auto"/>
+        <w:rPr>
+          <w:rFonts w:ascii="Calibri" w:cs="Calibri" w:eastAsia="Calibri" w:hAnsi="Calibri"/>
+          <w:color w:val="073763"/>
+        </w:rPr>
+      </w:pPr>
+      <w:r>
+        <w:rPr>
+          <w:rtl w:val="0"/>
+        </w:rPr>
+      </w:r>
+    </w:p>
+    <w:p>
+      <w:pPr>
+        <w:pBdr>
+          <w:top w:color="auto" w:space="0" w:sz="0" w:val="none"/>
+          <w:left w:color="auto" w:space="0" w:sz="0" w:val="none"/>
+          <w:bottom w:color="auto" w:space="0" w:sz="0" w:val="none"/>
+          <w:right w:color="auto" w:space="0" w:sz="0" w:val="none"/>
+          <w:between w:color="auto" w:space="0" w:sz="0" w:val="none"/>
+        </w:pBdr>
+        <w:shd w:fill="ffffff" w:val="clear"/>
+        <w:spacing w:line="240" w:lineRule="auto"/>
+        <w:rPr>
+          <w:rFonts w:ascii="Calibri" w:cs="Calibri" w:eastAsia="Calibri" w:hAnsi="Calibri"/>
+          <w:color w:val="073763"/>
+          <w:sz w:val="24"/>
+          <w:szCs w:val="24"/>
+        </w:rPr>
+      </w:pPr>
+      <w:r>
+        <w:rPr>
+          <w:rFonts w:ascii="Calibri" w:cs="Calibri" w:eastAsia="Calibri" w:hAnsi="Calibri"/>
+          <w:b w:val="1"/>
+          <w:bCs w:val="1"/>
+          <w:color w:val="073763"/>
+          <w:sz w:val="24"/>
+          <w:szCs w:val="24"/>
+          <w:rtl w:val="0"/>
+        </w:rPr>
+        <w:t xml:space="preserve">Pantry Connect — Full Stack Food Pantry Notification System</w:t>
+      </w:r>
+      <w:r>
+        <w:rPr>
+          <w:rFonts w:ascii="Calibri" w:cs="Calibri" w:eastAsia="Calibri" w:hAnsi="Calibri"/>
+          <w:b w:val="1"/>
+          <w:bCs w:val="1"/>
           <w:color w:val="073763"/>
           <w:sz w:val="26"/>
           <w:szCs w:val="26"/>
-        </w:rPr>
-      </w:pPr>
-      <w:r>
-        <w:rPr>
-          <w:rFonts w:ascii="Calibri" w:cs="Calibri" w:eastAsia="Calibri" w:hAnsi="Calibri"/>
-          <w:b w:val="1"/>
-          <w:bCs w:val="1"/>
-          <w:color w:val="073763"/>
-          <w:sz w:val="26"/>
-          <w:szCs w:val="26"/>
-          <w:rtl w:val="0"/>
-        </w:rPr>
-        <w:t xml:space="preserve">Pantry Connect — Full Stack Food Pantry Notification System   </w:t>
-      </w:r>
-      <w:r>
-        <w:rPr>
-          <w:rFonts w:ascii="Calibri" w:cs="Calibri" w:eastAsia="Calibri" w:hAnsi="Calibri"/>
-          <w:color w:val="073763"/>
-          <w:sz w:val="26"/>
-          <w:szCs w:val="26"/>
+          <w:rtl w:val="0"/>
+        </w:rPr>
+        <w:t xml:space="preserve">             </w:t>
+      </w:r>
+      <w:r>
+        <w:rPr>
+          <w:rFonts w:ascii="Calibri" w:cs="Calibri" w:eastAsia="Calibri" w:hAnsi="Calibri"/>
+          <w:b w:val="1"/>
+          <w:bCs w:val="1"/>
+          <w:color w:val="073763"/>
+          <w:sz w:val="24"/>
+          <w:szCs w:val="24"/>
+          <w:rtl w:val="0"/>
+        </w:rPr>
+        <w:t xml:space="preserve">    </w:t>
+      </w:r>
+      <w:r>
+        <w:rPr>
+          <w:rFonts w:ascii="Calibri" w:cs="Calibri" w:eastAsia="Calibri" w:hAnsi="Calibri"/>
+          <w:color w:val="073763"/>
+          <w:sz w:val="24"/>
+          <w:szCs w:val="24"/>
           <w:rtl w:val="0"/>
         </w:rPr>
         <w:t xml:space="preserve">Apr</w:t>
@@ -276,8 +346,8 @@
         <w:rPr>
           <w:rFonts w:ascii="Calibri" w:cs="Calibri" w:eastAsia="Calibri" w:hAnsi="Calibri"/>
           <w:color w:val="073763"/>
-          <w:sz w:val="26"/>
-          <w:szCs w:val="26"/>
+          <w:sz w:val="24"/>
+          <w:szCs w:val="24"/>
           <w:rtl w:val="0"/>
         </w:rPr>
         <w:t xml:space="preserve"> 2026 – June 2026</w:t>
@@ -341,14 +411,46 @@
           <w:between w:color="auto" w:space="0" w:sz="0" w:val="none"/>
         </w:pBdr>
         <w:shd w:fill="ffffff" w:val="clear"/>
+        <w:spacing w:line="180" w:lineRule="auto"/>
+        <w:rPr>
+          <w:rFonts w:ascii="Calibri" w:cs="Calibri" w:eastAsia="Calibri" w:hAnsi="Calibri"/>
+          <w:color w:val="073763"/>
+        </w:rPr>
+      </w:pPr>
+      <w:r>
+        <w:rPr>
+          <w:rtl w:val="0"/>
+        </w:rPr>
+      </w:r>
+    </w:p>
+    <w:p>
+      <w:pPr>
+        <w:pBdr>
+          <w:top w:color="auto" w:space="0" w:sz="0" w:val="none"/>
+          <w:left w:color="auto" w:space="0" w:sz="0" w:val="none"/>
+          <w:bottom w:color="auto" w:space="0" w:sz="0" w:val="none"/>
+          <w:right w:color="auto" w:space="0" w:sz="0" w:val="none"/>
+          <w:between w:color="auto" w:space="0" w:sz="0" w:val="none"/>
+        </w:pBdr>
+        <w:shd w:fill="ffffff" w:val="clear"/>
         <w:spacing w:line="240" w:lineRule="auto"/>
         <w:rPr>
           <w:rFonts w:ascii="Calibri" w:cs="Calibri" w:eastAsia="Calibri" w:hAnsi="Calibri"/>
           <w:color w:val="4f81bd"/>
-          <w:sz w:val="24"/>
-          <w:szCs w:val="24"/>
-        </w:rPr>
-      </w:pPr>
+        </w:rPr>
+      </w:pPr>
+      <w:r>
+        <w:rPr>
+          <w:rFonts w:ascii="Calibri" w:cs="Calibri" w:eastAsia="Calibri" w:hAnsi="Calibri"/>
+          <w:b w:val="1"/>
+          <w:bCs w:val="1"/>
+          <w:color w:val="073763"/>
+          <w:sz w:val="24"/>
+          <w:szCs w:val="24"/>
+          <w:rtl w:val="0"/>
+        </w:rPr>
+        <w:t xml:space="preserve">Conard’s Woodworks — React Business Storefront</w:t>
+      </w:r>
       <w:r>
         <w:rPr>
           <w:rFonts w:ascii="Calibri" w:cs="Calibri" w:eastAsia="Calibri" w:hAnsi="Calibri"/>
@@ -359,7 +461,7 @@
           <w:szCs w:val="26"/>
           <w:rtl w:val="0"/>
         </w:rPr>
-        <w:t xml:space="preserve">Conard’s Woodworks — React Business Storefront</w:t>
+        <w:t xml:space="preserve"> </w:t>
       </w:r>
       <w:r>
         <w:rPr>
@@ -371,14 +473,14 @@
           <w:szCs w:val="28"/>
           <w:rtl w:val="0"/>
         </w:rPr>
-        <w:t xml:space="preserve">                       </w:t>
-      </w:r>
-      <w:r>
-        <w:rPr>
-          <w:rFonts w:ascii="Calibri" w:cs="Calibri" w:eastAsia="Calibri" w:hAnsi="Calibri"/>
-          <w:color w:val="073763"/>
-          <w:sz w:val="26"/>
-          <w:szCs w:val="26"/>
+        <w:t xml:space="preserve">                                  </w:t>
+      </w:r>
+      <w:r>
+        <w:rPr>
+          <w:rFonts w:ascii="Calibri" w:cs="Calibri" w:eastAsia="Calibri" w:hAnsi="Calibri"/>
+          <w:color w:val="073763"/>
+          <w:sz w:val="24"/>
+          <w:szCs w:val="24"/>
           <w:rtl w:val="0"/>
         </w:rPr>
         <w:t xml:space="preserve">Sep 2025 – Jul 2026</w:t>
@@ -410,7 +512,7 @@
           <w:rFonts w:ascii="Calibri" w:cs="Calibri" w:eastAsia="Calibri" w:hAnsi="Calibri"/>
           <w:rtl w:val="0"/>
         </w:rPr>
-        <w:t xml:space="preserve">Expanded a web design pitch-deck project into a responsive React storefront with product galleries, auto-filled custom quote requests, and email functionality.               </w:t>
+        <w:t xml:space="preserve">Expanded a web design pitch-deck project into a responsive React storefront with product galleries, auto-filled custom quote requests, and email functionality.                  </w:t>
       </w:r>
       <w:r>
         <w:rPr>
@@ -481,18 +583,18 @@
           <w:b w:val="1"/>
           <w:bCs w:val="1"/>
           <w:color w:val="073763"/>
-          <w:sz w:val="28"/>
-          <w:szCs w:val="28"/>
-        </w:rPr>
-      </w:pPr>
-      <w:r>
-        <w:rPr>
-          <w:rFonts w:ascii="Calibri" w:cs="Calibri" w:eastAsia="Calibri" w:hAnsi="Calibri"/>
-          <w:b w:val="1"/>
-          <w:bCs w:val="1"/>
-          <w:color w:val="073763"/>
-          <w:sz w:val="28"/>
-          <w:szCs w:val="28"/>
+          <w:sz w:val="26"/>
+          <w:szCs w:val="26"/>
+        </w:rPr>
+      </w:pPr>
+      <w:r>
+        <w:rPr>
+          <w:rFonts w:ascii="Calibri" w:cs="Calibri" w:eastAsia="Calibri" w:hAnsi="Calibri"/>
+          <w:b w:val="1"/>
+          <w:bCs w:val="1"/>
+          <w:color w:val="073763"/>
+          <w:sz w:val="26"/>
+          <w:szCs w:val="26"/>
           <w:rtl w:val="0"/>
         </w:rPr>
         <w:t xml:space="preserve">TECHNICAL SKILLS</w:t>
@@ -532,7 +634,7 @@
           <w:between w:color="auto" w:space="0" w:sz="0" w:val="none"/>
         </w:pBdr>
         <w:shd w:fill="ffffff" w:val="clear"/>
-        <w:spacing w:after="20" w:line="240" w:lineRule="auto"/>
+        <w:spacing w:after="20" w:line="180" w:lineRule="auto"/>
         <w:jc w:val="center"/>
         <w:rPr>
           <w:rFonts w:ascii="Calibri" w:cs="Calibri" w:eastAsia="Calibri" w:hAnsi="Calibri"/>
@@ -558,37 +660,6 @@
           <w:rFonts w:ascii="Calibri" w:cs="Calibri" w:eastAsia="Calibri" w:hAnsi="Calibri"/>
           <w:b w:val="1"/>
           <w:bCs w:val="1"/>
-          <w:color w:val="073763"/>
-          <w:sz w:val="28"/>
-          <w:szCs w:val="28"/>
-        </w:rPr>
-      </w:pPr>
-      <w:r>
-        <w:rPr>
-          <w:rFonts w:ascii="Calibri" w:cs="Calibri" w:eastAsia="Calibri" w:hAnsi="Calibri"/>
-          <w:b w:val="1"/>
-          <w:bCs w:val="1"/>
-          <w:color w:val="073763"/>
-          <w:sz w:val="28"/>
-          <w:szCs w:val="28"/>
-          <w:rtl w:val="0"/>
-        </w:rPr>
-        <w:t xml:space="preserve">EDUCATION</w:t>
-      </w:r>
-    </w:p>
-    <w:p>
-      <w:pPr>
-        <w:pBdr>
-          <w:top w:color="auto" w:space="0" w:sz="0" w:val="none"/>
-          <w:left w:color="auto" w:space="0" w:sz="0" w:val="none"/>
-          <w:bottom w:color="auto" w:space="0" w:sz="0" w:val="none"/>
-          <w:right w:color="auto" w:space="0" w:sz="0" w:val="none"/>
-          <w:between w:color="auto" w:space="0" w:sz="0" w:val="none"/>
-        </w:pBdr>
-        <w:shd w:fill="ffffff" w:val="clear"/>
-        <w:spacing w:line="240" w:lineRule="auto"/>
-        <w:rPr>
-          <w:rFonts w:ascii="Calibri" w:cs="Calibri" w:eastAsia="Calibri" w:hAnsi="Calibri"/>
           <w:color w:val="073763"/>
           <w:sz w:val="26"/>
           <w:szCs w:val="26"/>
@@ -604,16 +675,59 @@
           <w:szCs w:val="26"/>
           <w:rtl w:val="0"/>
         </w:rPr>
-        <w:t xml:space="preserve">Portland Community College — AAS, Web Development &amp; Design </w:t>
-      </w:r>
-      <w:r>
-        <w:rPr>
-          <w:rFonts w:ascii="Calibri" w:cs="Calibri" w:eastAsia="Calibri" w:hAnsi="Calibri"/>
+        <w:t xml:space="preserve">EDUCATION</w:t>
+      </w:r>
+    </w:p>
+    <w:p>
+      <w:pPr>
+        <w:pBdr>
+          <w:top w:color="auto" w:space="0" w:sz="0" w:val="none"/>
+          <w:left w:color="auto" w:space="0" w:sz="0" w:val="none"/>
+          <w:bottom w:color="auto" w:space="0" w:sz="0" w:val="none"/>
+          <w:right w:color="auto" w:space="0" w:sz="0" w:val="none"/>
+          <w:between w:color="auto" w:space="0" w:sz="0" w:val="none"/>
+        </w:pBdr>
+        <w:shd w:fill="ffffff" w:val="clear"/>
+        <w:spacing w:line="240" w:lineRule="auto"/>
+        <w:rPr>
+          <w:rFonts w:ascii="Calibri" w:cs="Calibri" w:eastAsia="Calibri" w:hAnsi="Calibri"/>
+          <w:color w:val="073763"/>
+          <w:sz w:val="24"/>
+          <w:szCs w:val="24"/>
+        </w:rPr>
+      </w:pPr>
+      <w:r>
+        <w:rPr>
+          <w:rFonts w:ascii="Calibri" w:cs="Calibri" w:eastAsia="Calibri" w:hAnsi="Calibri"/>
+          <w:b w:val="1"/>
+          <w:bCs w:val="1"/>
+          <w:color w:val="073763"/>
+          <w:sz w:val="24"/>
+          <w:szCs w:val="24"/>
+          <w:rtl w:val="0"/>
+        </w:rPr>
+        <w:t xml:space="preserve">Portland Community College — AAS, Web Development &amp; Design</w:t>
+      </w:r>
+      <w:r>
+        <w:rPr>
+          <w:rFonts w:ascii="Calibri" w:cs="Calibri" w:eastAsia="Calibri" w:hAnsi="Calibri"/>
+          <w:b w:val="1"/>
+          <w:bCs w:val="1"/>
           <w:color w:val="073763"/>
           <w:sz w:val="26"/>
           <w:szCs w:val="26"/>
           <w:rtl w:val="0"/>
         </w:rPr>
+        <w:t xml:space="preserve">              </w:t>
+      </w:r>
+      <w:r>
+        <w:rPr>
+          <w:rFonts w:ascii="Calibri" w:cs="Calibri" w:eastAsia="Calibri" w:hAnsi="Calibri"/>
+          <w:color w:val="073763"/>
+          <w:sz w:val="24"/>
+          <w:szCs w:val="24"/>
+          <w:rtl w:val="0"/>
+        </w:rPr>
         <w:t xml:space="preserve">Sep 2024 – Jun 2026</w:t>
       </w:r>
     </w:p>
@@ -638,27 +752,6 @@
           <w:rtl w:val="0"/>
         </w:rPr>
         <w:t xml:space="preserve">Highest Honors | 4.0 GPA | Phi Theta Kappa National Honor Society</w:t>
-      </w:r>
-    </w:p>
-    <w:p>
-      <w:pPr>
-        <w:pBdr>
-          <w:top w:color="auto" w:space="0" w:sz="0" w:val="none"/>
-          <w:left w:color="auto" w:space="0" w:sz="0" w:val="none"/>
-          <w:bottom w:color="auto" w:space="0" w:sz="0" w:val="none"/>
-          <w:right w:color="auto" w:space="0" w:sz="0" w:val="none"/>
-          <w:between w:color="auto" w:space="0" w:sz="0" w:val="none"/>
-        </w:pBdr>
-        <w:shd w:fill="ffffff" w:val="clear"/>
-        <w:spacing w:after="20" w:line="240" w:lineRule="auto"/>
-        <w:rPr>
-          <w:rFonts w:ascii="Calibri" w:cs="Calibri" w:eastAsia="Calibri" w:hAnsi="Calibri"/>
-        </w:rPr>
-      </w:pPr>
-      <w:r>
-        <w:rPr>
-          <w:rtl w:val="0"/>
-        </w:rPr>
       </w:r>
     </w:p>
     <w:p>
@@ -685,73 +778,66 @@
           <w:b w:val="1"/>
           <w:bCs w:val="1"/>
           <w:color w:val="073763"/>
+          <w:sz w:val="24"/>
+          <w:szCs w:val="24"/>
+          <w:rtl w:val="0"/>
+        </w:rPr>
+        <w:t xml:space="preserve">Portland Community College — Database Design &amp; SQL Certificate</w:t>
+      </w:r>
+      <w:r>
+        <w:rPr>
+          <w:rFonts w:ascii="Calibri" w:cs="Calibri" w:eastAsia="Calibri" w:hAnsi="Calibri"/>
+          <w:b w:val="1"/>
+          <w:bCs w:val="1"/>
+          <w:color w:val="073763"/>
           <w:sz w:val="26"/>
           <w:szCs w:val="26"/>
           <w:rtl w:val="0"/>
         </w:rPr>
-        <w:t xml:space="preserve">Portland Community College — Database Design &amp; SQL Certificate </w:t>
-      </w:r>
-      <w:r>
-        <w:rPr>
-          <w:rFonts w:ascii="Calibri" w:cs="Calibri" w:eastAsia="Calibri" w:hAnsi="Calibri"/>
-          <w:color w:val="073763"/>
-          <w:sz w:val="26"/>
-          <w:szCs w:val="26"/>
+        <w:t xml:space="preserve">             </w:t>
+      </w:r>
+      <w:r>
+        <w:rPr>
+          <w:rFonts w:ascii="Calibri" w:cs="Calibri" w:eastAsia="Calibri" w:hAnsi="Calibri"/>
+          <w:color w:val="073763"/>
+          <w:sz w:val="24"/>
+          <w:szCs w:val="24"/>
           <w:rtl w:val="0"/>
         </w:rPr>
         <w:t xml:space="preserve">Apr 2025 – Jun 2026</w:t>
       </w:r>
-    </w:p>
-    <w:p>
-      <w:pPr>
-        <w:pBdr>
-          <w:top w:color="auto" w:space="0" w:sz="0" w:val="none"/>
-          <w:left w:color="auto" w:space="0" w:sz="0" w:val="none"/>
-          <w:bottom w:color="auto" w:space="0" w:sz="0" w:val="none"/>
-          <w:right w:color="auto" w:space="0" w:sz="0" w:val="none"/>
-          <w:between w:color="auto" w:space="0" w:sz="0" w:val="none"/>
-        </w:pBdr>
-        <w:shd w:fill="ffffff" w:val="clear"/>
-        <w:spacing w:line="240" w:lineRule="auto"/>
-        <w:rPr>
-          <w:rFonts w:ascii="Calibri" w:cs="Calibri" w:eastAsia="Calibri" w:hAnsi="Calibri"/>
-          <w:color w:val="073763"/>
-          <w:sz w:val="26"/>
-          <w:szCs w:val="26"/>
-        </w:rPr>
-      </w:pPr>
-      <w:r>
-        <w:rPr>
-          <w:rtl w:val="0"/>
-        </w:rPr>
-      </w:r>
-    </w:p>
-    <w:p>
-      <w:pPr>
-        <w:pBdr>
-          <w:top w:color="auto" w:space="0" w:sz="0" w:val="none"/>
-          <w:left w:color="auto" w:space="0" w:sz="0" w:val="none"/>
-          <w:bottom w:color="auto" w:space="0" w:sz="0" w:val="none"/>
-          <w:right w:color="auto" w:space="0" w:sz="0" w:val="none"/>
-          <w:between w:color="auto" w:space="0" w:sz="0" w:val="none"/>
-        </w:pBdr>
-        <w:shd w:fill="ffffff" w:val="clear"/>
-        <w:spacing w:line="240" w:lineRule="auto"/>
-        <w:rPr>
-          <w:rFonts w:ascii="Calibri" w:cs="Calibri" w:eastAsia="Calibri" w:hAnsi="Calibri"/>
-          <w:color w:val="073763"/>
-          <w:sz w:val="26"/>
-          <w:szCs w:val="26"/>
-        </w:rPr>
-      </w:pPr>
-      <w:r>
-        <w:rPr>
-          <w:rFonts w:ascii="Calibri" w:cs="Calibri" w:eastAsia="Calibri" w:hAnsi="Calibri"/>
-          <w:b w:val="1"/>
-          <w:bCs w:val="1"/>
-          <w:color w:val="073763"/>
-          <w:sz w:val="26"/>
-          <w:szCs w:val="26"/>
+      <w:r>
+        <w:rPr>
+          <w:rtl w:val="0"/>
+        </w:rPr>
+      </w:r>
+    </w:p>
+    <w:p>
+      <w:pPr>
+        <w:pBdr>
+          <w:top w:color="auto" w:space="0" w:sz="0" w:val="none"/>
+          <w:left w:color="auto" w:space="0" w:sz="0" w:val="none"/>
+          <w:bottom w:color="auto" w:space="0" w:sz="0" w:val="none"/>
+          <w:right w:color="auto" w:space="0" w:sz="0" w:val="none"/>
+          <w:between w:color="auto" w:space="0" w:sz="0" w:val="none"/>
+        </w:pBdr>
+        <w:shd w:fill="ffffff" w:val="clear"/>
+        <w:spacing w:line="240" w:lineRule="auto"/>
+        <w:rPr>
+          <w:rFonts w:ascii="Calibri" w:cs="Calibri" w:eastAsia="Calibri" w:hAnsi="Calibri"/>
+          <w:color w:val="073763"/>
+          <w:sz w:val="24"/>
+          <w:szCs w:val="24"/>
+        </w:rPr>
+      </w:pPr>
+      <w:r>
+        <w:rPr>
+          <w:rFonts w:ascii="Calibri" w:cs="Calibri" w:eastAsia="Calibri" w:hAnsi="Calibri"/>
+          <w:b w:val="1"/>
+          <w:bCs w:val="1"/>
+          <w:color w:val="073763"/>
+          <w:sz w:val="24"/>
+          <w:szCs w:val="24"/>
           <w:rtl w:val="0"/>
         </w:rPr>
         <w:t xml:space="preserve">New Mexico State University — B.A., Communication Studies</w:t>
@@ -766,106 +852,83 @@
           <w:szCs w:val="26"/>
           <w:rtl w:val="0"/>
         </w:rPr>
-        <w:t xml:space="preserve"> </w:t>
-      </w:r>
-      <w:r>
-        <w:rPr>
-          <w:rFonts w:ascii="Calibri" w:cs="Calibri" w:eastAsia="Calibri" w:hAnsi="Calibri"/>
+        <w:t xml:space="preserve">                    </w:t>
+      </w:r>
+      <w:r>
+        <w:rPr>
+          <w:rFonts w:ascii="Calibri" w:cs="Calibri" w:eastAsia="Calibri" w:hAnsi="Calibri"/>
+          <w:color w:val="073763"/>
+          <w:sz w:val="24"/>
+          <w:szCs w:val="24"/>
+          <w:rtl w:val="0"/>
+        </w:rPr>
+        <w:t xml:space="preserve">Aug 2013 – Dec 2015</w:t>
+      </w:r>
+    </w:p>
+    <w:p>
+      <w:pPr>
+        <w:pBdr>
+          <w:top w:color="auto" w:space="0" w:sz="0" w:val="none"/>
+          <w:left w:color="auto" w:space="0" w:sz="0" w:val="none"/>
+          <w:bottom w:color="auto" w:space="0" w:sz="0" w:val="none"/>
+          <w:right w:color="auto" w:space="0" w:sz="0" w:val="none"/>
+          <w:between w:color="auto" w:space="0" w:sz="0" w:val="none"/>
+        </w:pBdr>
+        <w:shd w:fill="ffffff" w:val="clear"/>
+        <w:spacing w:line="240" w:lineRule="auto"/>
+        <w:rPr>
+          <w:rFonts w:ascii="Calibri" w:cs="Calibri" w:eastAsia="Calibri" w:hAnsi="Calibri"/>
+        </w:rPr>
+      </w:pPr>
+      <w:r>
+        <w:rPr>
+          <w:rFonts w:ascii="Calibri" w:cs="Calibri" w:eastAsia="Calibri" w:hAnsi="Calibri"/>
+          <w:rtl w:val="0"/>
+        </w:rPr>
+        <w:t xml:space="preserve">3.5 GPA | Student Athlete | Scholar Athlete</w:t>
+      </w:r>
+    </w:p>
+    <w:p>
+      <w:pPr>
+        <w:pBdr>
+          <w:top w:color="auto" w:space="0" w:sz="0" w:val="none"/>
+          <w:left w:color="auto" w:space="0" w:sz="0" w:val="none"/>
+          <w:bottom w:color="auto" w:space="0" w:sz="0" w:val="none"/>
+          <w:right w:color="auto" w:space="0" w:sz="0" w:val="none"/>
+          <w:between w:color="auto" w:space="0" w:sz="0" w:val="none"/>
+        </w:pBdr>
+        <w:shd w:fill="ffffff" w:val="clear"/>
+        <w:spacing w:line="240" w:lineRule="auto"/>
+        <w:rPr>
+          <w:rFonts w:ascii="Calibri" w:cs="Calibri" w:eastAsia="Calibri" w:hAnsi="Calibri"/>
+        </w:rPr>
+      </w:pPr>
+      <w:r>
+        <w:rPr>
+          <w:rtl w:val="0"/>
+        </w:rPr>
+      </w:r>
+    </w:p>
+    <w:p>
+      <w:pPr>
+        <w:pBdr>
+          <w:top w:color="auto" w:space="0" w:sz="0" w:val="none"/>
+          <w:left w:color="auto" w:space="0" w:sz="0" w:val="none"/>
+          <w:bottom w:color="808080" w:space="0" w:sz="6" w:val="single"/>
+          <w:right w:color="auto" w:space="0" w:sz="0" w:val="none"/>
+        </w:pBdr>
+        <w:shd w:fill="ffffff" w:val="clear"/>
+        <w:spacing w:after="40" w:before="100" w:line="240" w:lineRule="auto"/>
+        <w:rPr>
+          <w:rFonts w:ascii="Calibri" w:cs="Calibri" w:eastAsia="Calibri" w:hAnsi="Calibri"/>
+          <w:b w:val="1"/>
+          <w:bCs w:val="1"/>
           <w:color w:val="073763"/>
           <w:sz w:val="26"/>
           <w:szCs w:val="26"/>
-          <w:rtl w:val="0"/>
-        </w:rPr>
-        <w:t xml:space="preserve">Aug 2013 – Dec 2015</w:t>
-      </w:r>
-    </w:p>
-    <w:p>
-      <w:pPr>
-        <w:pBdr>
-          <w:top w:color="auto" w:space="0" w:sz="0" w:val="none"/>
-          <w:left w:color="auto" w:space="0" w:sz="0" w:val="none"/>
-          <w:bottom w:color="auto" w:space="0" w:sz="0" w:val="none"/>
-          <w:right w:color="auto" w:space="0" w:sz="0" w:val="none"/>
-          <w:between w:color="auto" w:space="0" w:sz="0" w:val="none"/>
-        </w:pBdr>
-        <w:shd w:fill="ffffff" w:val="clear"/>
-        <w:spacing w:line="240" w:lineRule="auto"/>
-        <w:rPr>
-          <w:rFonts w:ascii="Calibri" w:cs="Calibri" w:eastAsia="Calibri" w:hAnsi="Calibri"/>
-        </w:rPr>
-      </w:pPr>
-      <w:r>
-        <w:rPr>
-          <w:rFonts w:ascii="Calibri" w:cs="Calibri" w:eastAsia="Calibri" w:hAnsi="Calibri"/>
-          <w:rtl w:val="0"/>
-        </w:rPr>
-        <w:t xml:space="preserve">3.5 GPA | Student Athlete | Scholar Athlete</w:t>
-      </w:r>
-    </w:p>
-    <w:p>
-      <w:pPr>
-        <w:pBdr>
-          <w:top w:color="auto" w:space="0" w:sz="0" w:val="none"/>
-          <w:left w:color="auto" w:space="0" w:sz="0" w:val="none"/>
-          <w:bottom w:color="auto" w:space="0" w:sz="0" w:val="none"/>
-          <w:right w:color="auto" w:space="0" w:sz="0" w:val="none"/>
-          <w:between w:color="auto" w:space="0" w:sz="0" w:val="none"/>
-        </w:pBdr>
-        <w:shd w:fill="ffffff" w:val="clear"/>
-        <w:spacing w:line="240" w:lineRule="auto"/>
-        <w:rPr>
-          <w:rFonts w:ascii="Calibri" w:cs="Calibri" w:eastAsia="Calibri" w:hAnsi="Calibri"/>
-        </w:rPr>
-      </w:pPr>
-      <w:r>
-        <w:rPr>
-          <w:rtl w:val="0"/>
-        </w:rPr>
-      </w:r>
-    </w:p>
-    <w:p>
-      <w:pPr>
-        <w:pBdr>
-          <w:top w:color="auto" w:space="0" w:sz="0" w:val="none"/>
-          <w:left w:color="auto" w:space="0" w:sz="0" w:val="none"/>
-          <w:bottom w:color="808080" w:space="0" w:sz="6" w:val="single"/>
-          <w:right w:color="auto" w:space="0" w:sz="0" w:val="none"/>
-        </w:pBdr>
-        <w:shd w:fill="ffffff" w:val="clear"/>
-        <w:spacing w:after="40" w:before="100" w:line="240" w:lineRule="auto"/>
-        <w:rPr>
-          <w:rFonts w:ascii="Calibri" w:cs="Calibri" w:eastAsia="Calibri" w:hAnsi="Calibri"/>
-          <w:b w:val="1"/>
-          <w:bCs w:val="1"/>
-          <w:color w:val="073763"/>
-          <w:sz w:val="28"/>
-          <w:szCs w:val="28"/>
-        </w:rPr>
-      </w:pPr>
-      <w:r>
-        <w:rPr>
-          <w:rFonts w:ascii="Calibri" w:cs="Calibri" w:eastAsia="Calibri" w:hAnsi="Calibri"/>
-          <w:b w:val="1"/>
-          <w:bCs w:val="1"/>
-          <w:color w:val="073763"/>
-          <w:sz w:val="28"/>
-          <w:szCs w:val="28"/>
-          <w:rtl w:val="0"/>
-        </w:rPr>
-        <w:t xml:space="preserve">PROFESSIONAL EXPERIENCE</w:t>
-      </w:r>
-    </w:p>
-    <w:p>
-      <w:pPr>
-        <w:pBdr>
-          <w:top w:color="auto" w:space="0" w:sz="0" w:val="none"/>
-          <w:left w:color="auto" w:space="0" w:sz="0" w:val="none"/>
-          <w:bottom w:color="auto" w:space="0" w:sz="0" w:val="none"/>
-          <w:right w:color="auto" w:space="0" w:sz="0" w:val="none"/>
-          <w:between w:color="auto" w:space="0" w:sz="0" w:val="none"/>
-        </w:pBdr>
-        <w:shd w:fill="ffffff" w:val="clear"/>
-        <w:spacing w:line="240" w:lineRule="auto"/>
+        </w:rPr>
+      </w:pPr>
+      <w:r>
         <w:rPr>
           <w:rFonts w:ascii="Calibri" w:cs="Calibri" w:eastAsia="Calibri" w:hAnsi="Calibri"/>
           <w:b w:val="1"/>
@@ -873,16 +936,39 @@
           <w:color w:val="073763"/>
           <w:sz w:val="26"/>
           <w:szCs w:val="26"/>
-        </w:rPr>
-      </w:pPr>
-      <w:r>
-        <w:rPr>
-          <w:rFonts w:ascii="Calibri" w:cs="Calibri" w:eastAsia="Calibri" w:hAnsi="Calibri"/>
-          <w:b w:val="1"/>
-          <w:bCs w:val="1"/>
-          <w:color w:val="073763"/>
-          <w:sz w:val="26"/>
-          <w:szCs w:val="26"/>
+          <w:rtl w:val="0"/>
+        </w:rPr>
+        <w:t xml:space="preserve">PROFESSIONAL EXPERIENCE</w:t>
+      </w:r>
+    </w:p>
+    <w:p>
+      <w:pPr>
+        <w:pBdr>
+          <w:top w:color="auto" w:space="0" w:sz="0" w:val="none"/>
+          <w:left w:color="auto" w:space="0" w:sz="0" w:val="none"/>
+          <w:bottom w:color="auto" w:space="0" w:sz="0" w:val="none"/>
+          <w:right w:color="auto" w:space="0" w:sz="0" w:val="none"/>
+          <w:between w:color="auto" w:space="0" w:sz="0" w:val="none"/>
+        </w:pBdr>
+        <w:shd w:fill="ffffff" w:val="clear"/>
+        <w:spacing w:line="240" w:lineRule="auto"/>
+        <w:rPr>
+          <w:rFonts w:ascii="Calibri" w:cs="Calibri" w:eastAsia="Calibri" w:hAnsi="Calibri"/>
+          <w:b w:val="1"/>
+          <w:bCs w:val="1"/>
+          <w:color w:val="073763"/>
+          <w:sz w:val="24"/>
+          <w:szCs w:val="24"/>
+        </w:rPr>
+      </w:pPr>
+      <w:r>
+        <w:rPr>
+          <w:rFonts w:ascii="Calibri" w:cs="Calibri" w:eastAsia="Calibri" w:hAnsi="Calibri"/>
+          <w:b w:val="1"/>
+          <w:bCs w:val="1"/>
+          <w:color w:val="073763"/>
+          <w:sz w:val="24"/>
+          <w:szCs w:val="24"/>
           <w:rtl w:val="0"/>
         </w:rPr>
         <w:t xml:space="preserve">24 Hour Fitness — General Manager / Assistant GM / Fitness Manager </w:t>
@@ -902,16 +988,16 @@
         <w:rPr>
           <w:rFonts w:ascii="Calibri" w:cs="Calibri" w:eastAsia="Calibri" w:hAnsi="Calibri"/>
           <w:color w:val="073763"/>
-          <w:sz w:val="26"/>
-          <w:szCs w:val="26"/>
-        </w:rPr>
-      </w:pPr>
-      <w:r>
-        <w:rPr>
-          <w:rFonts w:ascii="Calibri" w:cs="Calibri" w:eastAsia="Calibri" w:hAnsi="Calibri"/>
-          <w:color w:val="073763"/>
-          <w:sz w:val="26"/>
-          <w:szCs w:val="26"/>
+          <w:sz w:val="24"/>
+          <w:szCs w:val="24"/>
+        </w:rPr>
+      </w:pPr>
+      <w:r>
+        <w:rPr>
+          <w:rFonts w:ascii="Calibri" w:cs="Calibri" w:eastAsia="Calibri" w:hAnsi="Calibri"/>
+          <w:color w:val="073763"/>
+          <w:sz w:val="24"/>
+          <w:szCs w:val="24"/>
           <w:rtl w:val="0"/>
         </w:rPr>
         <w:t xml:space="preserve">Apr 2018 – Apr 2022</w:t>
@@ -979,18 +1065,18 @@
           <w:b w:val="1"/>
           <w:bCs w:val="1"/>
           <w:color w:val="073763"/>
-          <w:sz w:val="26"/>
-          <w:szCs w:val="26"/>
-        </w:rPr>
-      </w:pPr>
-      <w:r>
-        <w:rPr>
-          <w:rFonts w:ascii="Calibri" w:cs="Calibri" w:eastAsia="Calibri" w:hAnsi="Calibri"/>
-          <w:b w:val="1"/>
-          <w:bCs w:val="1"/>
-          <w:color w:val="073763"/>
-          <w:sz w:val="26"/>
-          <w:szCs w:val="26"/>
+          <w:sz w:val="24"/>
+          <w:szCs w:val="24"/>
+        </w:rPr>
+      </w:pPr>
+      <w:r>
+        <w:rPr>
+          <w:rFonts w:ascii="Calibri" w:cs="Calibri" w:eastAsia="Calibri" w:hAnsi="Calibri"/>
+          <w:b w:val="1"/>
+          <w:bCs w:val="1"/>
+          <w:color w:val="073763"/>
+          <w:sz w:val="24"/>
+          <w:szCs w:val="24"/>
           <w:rtl w:val="0"/>
         </w:rPr>
         <w:t xml:space="preserve">Seasons 52 Fresh Grille &amp; Wine Bar — Server </w:t>
@@ -1010,16 +1096,16 @@
         <w:rPr>
           <w:rFonts w:ascii="Calibri" w:cs="Calibri" w:eastAsia="Calibri" w:hAnsi="Calibri"/>
           <w:color w:val="073763"/>
-          <w:sz w:val="26"/>
-          <w:szCs w:val="26"/>
-        </w:rPr>
-      </w:pPr>
-      <w:r>
-        <w:rPr>
-          <w:rFonts w:ascii="Calibri" w:cs="Calibri" w:eastAsia="Calibri" w:hAnsi="Calibri"/>
-          <w:color w:val="073763"/>
-          <w:sz w:val="26"/>
-          <w:szCs w:val="26"/>
+          <w:sz w:val="24"/>
+          <w:szCs w:val="24"/>
+        </w:rPr>
+      </w:pPr>
+      <w:r>
+        <w:rPr>
+          <w:rFonts w:ascii="Calibri" w:cs="Calibri" w:eastAsia="Calibri" w:hAnsi="Calibri"/>
+          <w:color w:val="073763"/>
+          <w:sz w:val="24"/>
+          <w:szCs w:val="24"/>
           <w:rtl w:val="0"/>
         </w:rPr>
         <w:t xml:space="preserve">Oct 2022 – Jun 2024</w:t>

</xml_diff>

<commit_message>
docs: replaced resume with updated version
</commit_message>
<xml_diff>
--- a/public/files/DeveloperResume_August2026.docx
+++ b/public/files/DeveloperResume_August2026.docx
@@ -121,6 +121,38 @@
         <w:pBdr>
           <w:top w:color="auto" w:space="0" w:sz="0" w:val="none"/>
           <w:left w:color="auto" w:space="0" w:sz="0" w:val="none"/>
+          <w:bottom w:color="auto" w:space="0" w:sz="0" w:val="none"/>
+          <w:right w:color="auto" w:space="0" w:sz="0" w:val="none"/>
+          <w:between w:color="auto" w:space="0" w:sz="0" w:val="none"/>
+        </w:pBdr>
+        <w:shd w:fill="ffffff" w:val="clear"/>
+        <w:spacing w:after="60" w:line="240" w:lineRule="auto"/>
+        <w:rPr>
+          <w:rFonts w:ascii="Calibri" w:cs="Calibri" w:eastAsia="Calibri" w:hAnsi="Calibri"/>
+          <w:sz w:val="24"/>
+          <w:szCs w:val="24"/>
+        </w:rPr>
+      </w:pPr>
+      <w:r>
+        <w:rPr>
+          <w:rFonts w:ascii="Calibri" w:cs="Calibri" w:eastAsia="Calibri" w:hAnsi="Calibri"/>
+          <w:sz w:val="24"/>
+          <w:szCs w:val="24"/>
+          <w:rtl w:val="0"/>
+        </w:rPr>
+        <w:t xml:space="preserve">Full-stack web developer transitioning from 6+ years in operations management, bringing production-minded discipline to React/Node projects.  </w:t>
+      </w:r>
+      <w:r>
+        <w:rPr>
+          <w:rtl w:val="0"/>
+        </w:rPr>
+      </w:r>
+    </w:p>
+    <w:p>
+      <w:pPr>
+        <w:pBdr>
+          <w:top w:color="auto" w:space="0" w:sz="0" w:val="none"/>
+          <w:left w:color="auto" w:space="0" w:sz="0" w:val="none"/>
           <w:bottom w:color="808080" w:space="0" w:sz="6" w:val="single"/>
           <w:right w:color="auto" w:space="0" w:sz="0" w:val="none"/>
         </w:pBdr>
@@ -188,7 +220,7 @@
           <w:szCs w:val="26"/>
           <w:rtl w:val="0"/>
         </w:rPr>
-        <w:t xml:space="preserve">                                                 </w:t>
+        <w:t xml:space="preserve">                                               </w:t>
       </w:r>
       <w:r>
         <w:rPr>
@@ -222,7 +254,7 @@
           <w:rFonts w:ascii="Calibri" w:cs="Calibri" w:eastAsia="Calibri" w:hAnsi="Calibri"/>
           <w:rtl w:val="0"/>
         </w:rPr>
-        <w:t xml:space="preserve">Full-stack React workout tracking application, allowing users to log and review workouts stored in PostgreSQL through Supabase. Built with React Hook Form for input validation and Supabase Auth for user authentication and database operations.                        </w:t>
+        <w:t xml:space="preserve">Full-stack React workout tracking application, allowing users to log and review workouts stored in PostgreSQL through Supabase. Built with React Hook Form for input validation and Supabase Auth for user authentication and database operations.                      </w:t>
       </w:r>
       <w:r>
         <w:rPr>
@@ -330,7 +362,7 @@
           <w:szCs w:val="24"/>
           <w:rtl w:val="0"/>
         </w:rPr>
-        <w:t xml:space="preserve">    </w:t>
+        <w:t xml:space="preserve">  </w:t>
       </w:r>
       <w:r>
         <w:rPr>
@@ -374,7 +406,7 @@
           <w:rFonts w:ascii="Calibri" w:cs="Calibri" w:eastAsia="Calibri" w:hAnsi="Calibri"/>
           <w:rtl w:val="0"/>
         </w:rPr>
-        <w:t xml:space="preserve">Full-stack food pantry notification system developed as a capstone project to help a college food pantry communicate availability and events to students. Personally developed account creation, login, and password reset functionality using Node.js and Express, building a secure authentication workflow from scratch.                                                </w:t>
+        <w:t xml:space="preserve">Full-stack food pantry notification system developed as a capstone project to help a college food pantry communicate availability and events to students. Personally developed account creation, login, and password reset functionality using Node.js and Express, building a secure authentication workflow from scratch.                                              </w:t>
       </w:r>
       <w:r>
         <w:rPr>
@@ -473,7 +505,7 @@
           <w:szCs w:val="28"/>
           <w:rtl w:val="0"/>
         </w:rPr>
-        <w:t xml:space="preserve">                                  </w:t>
+        <w:t xml:space="preserve">                                </w:t>
       </w:r>
       <w:r>
         <w:rPr>
@@ -512,7 +544,7 @@
           <w:rFonts w:ascii="Calibri" w:cs="Calibri" w:eastAsia="Calibri" w:hAnsi="Calibri"/>
           <w:rtl w:val="0"/>
         </w:rPr>
-        <w:t xml:space="preserve">Expanded a web design pitch-deck project into a responsive React storefront with product galleries, auto-filled custom quote requests, and email functionality.                  </w:t>
+        <w:t xml:space="preserve">Expanded a web design pitch-deck project into a responsive React storefront with product galleries, auto-filled custom quote requests, and email functionality.               </w:t>
       </w:r>
       <w:r>
         <w:rPr>
@@ -551,28 +583,6 @@
         <w:pBdr>
           <w:top w:color="auto" w:space="0" w:sz="0" w:val="none"/>
           <w:left w:color="auto" w:space="0" w:sz="0" w:val="none"/>
-          <w:bottom w:color="auto" w:space="0" w:sz="0" w:val="none"/>
-          <w:right w:color="auto" w:space="0" w:sz="0" w:val="none"/>
-          <w:between w:color="auto" w:space="0" w:sz="0" w:val="none"/>
-        </w:pBdr>
-        <w:shd w:fill="ffffff" w:val="clear"/>
-        <w:spacing w:line="240" w:lineRule="auto"/>
-        <w:rPr>
-          <w:rFonts w:ascii="Calibri" w:cs="Calibri" w:eastAsia="Calibri" w:hAnsi="Calibri"/>
-          <w:color w:val="073763"/>
-        </w:rPr>
-      </w:pPr>
-      <w:r>
-        <w:rPr>
-          <w:rtl w:val="0"/>
-        </w:rPr>
-      </w:r>
-    </w:p>
-    <w:p>
-      <w:pPr>
-        <w:pBdr>
-          <w:top w:color="auto" w:space="0" w:sz="0" w:val="none"/>
-          <w:left w:color="auto" w:space="0" w:sz="0" w:val="none"/>
           <w:bottom w:color="808080" w:space="0" w:sz="6" w:val="single"/>
           <w:right w:color="auto" w:space="0" w:sz="0" w:val="none"/>
         </w:pBdr>
@@ -634,7 +644,7 @@
           <w:between w:color="auto" w:space="0" w:sz="0" w:val="none"/>
         </w:pBdr>
         <w:shd w:fill="ffffff" w:val="clear"/>
-        <w:spacing w:after="20" w:line="180" w:lineRule="auto"/>
+        <w:spacing w:after="20" w:line="240" w:lineRule="auto"/>
         <w:jc w:val="center"/>
         <w:rPr>
           <w:rFonts w:ascii="Calibri" w:cs="Calibri" w:eastAsia="Calibri" w:hAnsi="Calibri"/>
@@ -718,7 +728,7 @@
           <w:szCs w:val="26"/>
           <w:rtl w:val="0"/>
         </w:rPr>
-        <w:t xml:space="preserve">              </w:t>
+        <w:t xml:space="preserve">            </w:t>
       </w:r>
       <w:r>
         <w:rPr>
@@ -746,6 +756,13 @@
           <w:rFonts w:ascii="Calibri" w:cs="Calibri" w:eastAsia="Calibri" w:hAnsi="Calibri"/>
         </w:rPr>
       </w:pPr>
+      <w:r>
+        <w:rPr>
+          <w:rFonts w:ascii="Calibri" w:cs="Calibri" w:eastAsia="Calibri" w:hAnsi="Calibri"/>
+          <w:rtl w:val="0"/>
+        </w:rPr>
+        <w:t xml:space="preserve">Graduated | </w:t>
+      </w:r>
       <w:r>
         <w:rPr>
           <w:rFonts w:ascii="Calibri" w:cs="Calibri" w:eastAsia="Calibri" w:hAnsi="Calibri"/>
@@ -794,7 +811,7 @@
           <w:szCs w:val="26"/>
           <w:rtl w:val="0"/>
         </w:rPr>
-        <w:t xml:space="preserve">             </w:t>
+        <w:t xml:space="preserve">           </w:t>
       </w:r>
       <w:r>
         <w:rPr>
@@ -852,7 +869,7 @@
           <w:szCs w:val="26"/>
           <w:rtl w:val="0"/>
         </w:rPr>
-        <w:t xml:space="preserve">                    </w:t>
+        <w:t xml:space="preserve">                  </w:t>
       </w:r>
       <w:r>
         <w:rPr>
@@ -885,28 +902,14 @@
           <w:rFonts w:ascii="Calibri" w:cs="Calibri" w:eastAsia="Calibri" w:hAnsi="Calibri"/>
           <w:rtl w:val="0"/>
         </w:rPr>
+        <w:t xml:space="preserve">Graduated | </w:t>
+      </w:r>
+      <w:r>
+        <w:rPr>
+          <w:rFonts w:ascii="Calibri" w:cs="Calibri" w:eastAsia="Calibri" w:hAnsi="Calibri"/>
+          <w:rtl w:val="0"/>
+        </w:rPr>
         <w:t xml:space="preserve">3.5 GPA | Student Athlete | Scholar Athlete</w:t>
-      </w:r>
-    </w:p>
-    <w:p>
-      <w:pPr>
-        <w:pBdr>
-          <w:top w:color="auto" w:space="0" w:sz="0" w:val="none"/>
-          <w:left w:color="auto" w:space="0" w:sz="0" w:val="none"/>
-          <w:bottom w:color="auto" w:space="0" w:sz="0" w:val="none"/>
-          <w:right w:color="auto" w:space="0" w:sz="0" w:val="none"/>
-          <w:between w:color="auto" w:space="0" w:sz="0" w:val="none"/>
-        </w:pBdr>
-        <w:shd w:fill="ffffff" w:val="clear"/>
-        <w:spacing w:line="240" w:lineRule="auto"/>
-        <w:rPr>
-          <w:rFonts w:ascii="Calibri" w:cs="Calibri" w:eastAsia="Calibri" w:hAnsi="Calibri"/>
-        </w:rPr>
-      </w:pPr>
-      <w:r>
-        <w:rPr>
-          <w:rtl w:val="0"/>
-        </w:rPr>
       </w:r>
     </w:p>
     <w:p>
@@ -1135,12 +1138,28 @@
       </w:r>
     </w:p>
     <w:sectPr>
+      <w:headerReference r:id="rId10" w:type="default"/>
       <w:pgSz w:h="15840" w:w="12240" w:orient="portrait"/>
-      <w:pgMar w:bottom="1440" w:top="1440" w:left="1440" w:right="1440" w:header="720" w:footer="720"/>
+      <w:pgMar w:bottom="1440" w:top="1440" w:left="1440" w:right="1440" w:header="576" w:footer="576"/>
       <w:pgNumType w:start="1"/>
     </w:sectPr>
   </w:body>
 </w:document>
+</file>
+
+<file path=word/header1.xml><?xml version="1.0" encoding="utf-8"?>
+<w:hdr xmlns:mc="http://schemas.openxmlformats.org/markup-compatibility/2006" xmlns:o="urn:schemas-microsoft-com:office:office" xmlns:r="http://schemas.openxmlformats.org/officeDocument/2006/relationships" xmlns:m="http://schemas.openxmlformats.org/officeDocument/2006/math" xmlns:v="urn:schemas-microsoft-com:vml" xmlns:wp="http://schemas.openxmlformats.org/drawingml/2006/wordprocessingDrawing" xmlns:w10="urn:schemas-microsoft-com:office:word" xmlns:w="http://schemas.openxmlformats.org/wordprocessingml/2006/main" xmlns:wne="http://schemas.microsoft.com/office/word/2006/wordml" xmlns:sl="http://schemas.openxmlformats.org/schemaLibrary/2006/main" xmlns:a="http://schemas.openxmlformats.org/drawingml/2006/main" xmlns:pic="http://schemas.openxmlformats.org/drawingml/2006/picture" xmlns:c="http://schemas.openxmlformats.org/drawingml/2006/chart" xmlns:lc="http://schemas.openxmlformats.org/drawingml/2006/lockedCanvas" xmlns:dgm="http://schemas.openxmlformats.org/drawingml/2006/diagram" xmlns:wps="http://schemas.microsoft.com/office/word/2010/wordprocessingShape" xmlns:wpg="http://schemas.microsoft.com/office/word/2010/wordprocessingGroup" xmlns:w14="http://schemas.microsoft.com/office/word/2010/wordml" xmlns:w15="http://schemas.microsoft.com/office/word/2012/wordml" xmlns:w16="http://schemas.microsoft.com/office/word/2018/wordml" xmlns:w16cex="http://schemas.microsoft.com/office/word/2018/wordml/cex" xmlns:w16cid="http://schemas.microsoft.com/office/word/2016/wordml/cid" xmlns="http://schemas.microsoft.com/office/tasks/2019/documenttasks" xmlns:cr="http://schemas.microsoft.com/office/comments/2020/reactions">
+  <w:p>
+    <w:pPr>
+      <w:rPr/>
+    </w:pPr>
+    <w:r>
+      <w:rPr>
+        <w:rtl w:val="0"/>
+      </w:rPr>
+    </w:r>
+  </w:p>
+</w:hdr>
 </file>
 
 <file path=word/numbering.xml><?xml version="1.0" encoding="utf-8"?>

</xml_diff>